<commit_message>
add report for topic 1
</commit_message>
<xml_diff>
--- a/TP-KB-251-Illia-Chernonoh-lpr.docx
+++ b/TP-KB-251-Illia-Chernonoh-lpr.docx
@@ -1,14 +1,123 @@
 
 <file path=word/document.xml><?xml version="1.0" encoding="utf-8"?>
-<w:document xmlns:wpc="http://schemas.microsoft.com/office/word/2010/wordprocessingCanvas" xmlns:cx="http://schemas.microsoft.com/office/drawing/2014/chartex" xmlns:cx1="http://schemas.microsoft.com/office/drawing/2015/9/8/chartex" xmlns:cx2="http://schemas.microsoft.com/office/drawing/2015/10/21/chartex" xmlns:cx3="http://schemas.microsoft.com/office/drawing/2016/5/9/chartex" xmlns:cx4="http://schemas.microsoft.com/office/drawing/2016/5/10/chartex" xmlns:cx5="http://schemas.microsoft.com/office/drawing/2016/5/11/chartex" xmlns:cx6="http://schemas.microsoft.com/office/drawing/2016/5/12/chartex" xmlns:cx7="http://schemas.microsoft.com/office/drawing/2016/5/13/chartex" xmlns:cx8="http://schemas.microsoft.com/office/drawing/2016/5/14/chartex" xmlns:mc="http://schemas.openxmlformats.org/markup-compatibility/2006" xmlns:aink="http://schemas.microsoft.com/office/drawing/2016/ink" xmlns:am3d="http://schemas.microsoft.com/office/drawing/2017/model3d" xmlns:o="urn:schemas-microsoft-com:office:office" xmlns:oel="http://schemas.microsoft.com/office/2019/extlst" xmlns:r="http://schemas.openxmlformats.org/officeDocument/2006/relationships" xmlns:m="http://schemas.openxmlformats.org/officeDocument/2006/math" xmlns:v="urn:schemas-microsoft-com:vml" xmlns:wp14="http://schemas.microsoft.com/office/word/2010/wordprocessingDrawing" xmlns:wp="http://schemas.openxmlformats.org/drawingml/2006/wordprocessingDrawing" xmlns:w10="urn:schemas-microsoft-com:office:word" xmlns:w="http://schemas.openxmlformats.org/wordprocessingml/2006/main" xmlns:w14="http://schemas.microsoft.com/office/word/2010/wordml" xmlns:w15="http://schemas.microsoft.com/office/word/2012/wordml" xmlns:w16cex="http://schemas.microsoft.com/office/word/2018/wordml/cex" xmlns:w16cid="http://schemas.microsoft.com/office/word/2016/wordml/cid" xmlns:w16="http://schemas.microsoft.com/office/word/2018/wordml" xmlns:w16sdtdh="http://schemas.microsoft.com/office/word/2020/wordml/sdtdatahash" xmlns:w16se="http://schemas.microsoft.com/office/word/2015/wordml/symex" xmlns:wpg="http://schemas.microsoft.com/office/word/2010/wordprocessingGroup" xmlns:wpi="http://schemas.microsoft.com/office/word/2010/wordprocessingInk" xmlns:wne="http://schemas.microsoft.com/office/word/2006/wordml" xmlns:wps="http://schemas.microsoft.com/office/word/2010/wordprocessingShape" mc:Ignorable="w14 w15 w16se w16cid w16 w16cex w16sdtdh wp14">
+<w:document xmlns:wpc="http://schemas.microsoft.com/office/word/2010/wordprocessingCanvas" xmlns:cx="http://schemas.microsoft.com/office/drawing/2014/chartex" xmlns:cx1="http://schemas.microsoft.com/office/drawing/2015/9/8/chartex" xmlns:cx2="http://schemas.microsoft.com/office/drawing/2015/10/21/chartex" xmlns:cx3="http://schemas.microsoft.com/office/drawing/2016/5/9/chartex" xmlns:cx4="http://schemas.microsoft.com/office/drawing/2016/5/10/chartex" xmlns:cx5="http://schemas.microsoft.com/office/drawing/2016/5/11/chartex" xmlns:cx6="http://schemas.microsoft.com/office/drawing/2016/5/12/chartex" xmlns:cx7="http://schemas.microsoft.com/office/drawing/2016/5/13/chartex" xmlns:cx8="http://schemas.microsoft.com/office/drawing/2016/5/14/chartex" xmlns:mc="http://schemas.openxmlformats.org/markup-compatibility/2006" xmlns:aink="http://schemas.microsoft.com/office/drawing/2016/ink" xmlns:am3d="http://schemas.microsoft.com/office/drawing/2017/model3d" xmlns:o="urn:schemas-microsoft-com:office:office" xmlns:oel="http://schemas.microsoft.com/office/2019/extlst" xmlns:r="http://schemas.openxmlformats.org/officeDocument/2006/relationships" xmlns:m="http://schemas.openxmlformats.org/officeDocument/2006/math" xmlns:v="urn:schemas-microsoft-com:vml" xmlns:wp14="http://schemas.microsoft.com/office/word/2010/wordprocessingDrawing" xmlns:wp="http://schemas.openxmlformats.org/drawingml/2006/wordprocessingDrawing" xmlns:w10="urn:schemas-microsoft-com:office:word" xmlns:w="http://schemas.openxmlformats.org/wordprocessingml/2006/main" xmlns:w14="http://schemas.microsoft.com/office/word/2010/wordml" xmlns:w15="http://schemas.microsoft.com/office/word/2012/wordml" xmlns:w16cex="http://schemas.microsoft.com/office/word/2018/wordml/cex" xmlns:w16cid="http://schemas.microsoft.com/office/word/2016/wordml/cid" xmlns:w16="http://schemas.microsoft.com/office/word/2018/wordml" xmlns:w16sdtdh="http://schemas.microsoft.com/office/word/2020/wordml/sdtdatahash" xmlns:w16se="http://schemas.microsoft.com/office/word/2015/wordml/symex" xmlns:wpg="http://schemas.microsoft.com/office/word/2010/wordprocessingGroup" xmlns:wpi="http://schemas.microsoft.com/office/word/2010/wordprocessingInk" xmlns:wne="http://schemas.microsoft.com/office/word/2006/wordml" xmlns:wps="http://schemas.microsoft.com/office/word/2010/wordprocessingShape" xmlns:a="http://schemas.openxmlformats.org/drawingml/2006/main" xmlns:pic="http://schemas.openxmlformats.org/drawingml/2006/picture" xmlns:a14="http://schemas.microsoft.com/office/drawing/2010/main" mc:Ignorable="w14 w15 w16se w16cid w16 w16cex w16sdtdh wp14">
   <w:body>
     <w:p>
       <w:pPr>
         <w:ind w:firstLine="0"/>
         <w:jc w:val="center"/>
         <w:rPr>
+          <w:b w:val="1"/>
+          <w:bCs w:val="1"/>
+          <w:lang w:val="ru-RU"/>
+        </w:rPr>
+      </w:pPr>
+      <w:r>
+        <w:rPr>
+          <w:b w:val="1"/>
+          <w:bCs w:val="1"/>
+          <w:lang w:val="uk-UA"/>
+        </w:rPr>
+        <w:t xml:space="preserve">Звіт про виконання практичних завдань до лекцій з курсу Технології програмування на мові </w:t>
+      </w:r>
+      <w:r>
+        <w:rPr>
+          <w:b w:val="1"/>
+          <w:bCs w:val="1"/>
+        </w:rPr>
+        <w:t>Python</w:t>
+      </w:r>
+    </w:p>
+    <w:p>
+      <w:pPr>
+        <w:jc w:val="right"/>
+        <w:rPr>
+          <w:lang w:val="uk-UA"/>
+        </w:rPr>
+      </w:pPr>
+      <w:r>
+        <w:rPr>
+          <w:lang w:val="uk-UA"/>
+        </w:rPr>
+        <w:t>Звіт до Теми №1</w:t>
+      </w:r>
+    </w:p>
+    <w:p>
+      <w:pPr>
+        <w:jc w:val="right"/>
+      </w:pPr>
+      <w:r>
+        <w:rPr>
+          <w:lang w:val="uk-UA"/>
+        </w:rPr>
+        <w:t>Функції та змінні</w:t>
+      </w:r>
+    </w:p>
+    <w:p>
+      <w:pPr>
+        <w:jc w:val="right"/>
+      </w:pPr>
+      <w:r>
+        <w:rPr>
+          <w:lang w:val="uk-UA"/>
+        </w:rPr>
+        <w:t xml:space="preserve">Виконав </w:t>
+      </w:r>
+      <w:r>
+        <w:rPr>
+          <w:lang w:val="uk-UA"/>
+        </w:rPr>
+        <w:t>Черноног</w:t>
+      </w:r>
+      <w:r>
+        <w:rPr>
+          <w:lang w:val="uk-UA"/>
+        </w:rPr>
+        <w:t xml:space="preserve"> Iлля</w:t>
+      </w:r>
+    </w:p>
+    <w:p>
+      <w:pPr>
+        <w:jc w:val="right"/>
+      </w:pPr>
+      <w:r>
+        <w:rPr>
+          <w:lang w:val="uk-UA"/>
+        </w:rPr>
+        <w:t>КБ-251</w:t>
+      </w:r>
+    </w:p>
+    <w:p>
+      <w:pPr>
+        <w:rPr>
+          <w:lang w:val="uk-UA"/>
+        </w:rPr>
+      </w:pPr>
+      <w:r>
+        <w:rPr>
+          <w:lang w:val="uk-UA"/>
+        </w:rPr>
+        <w:t xml:space="preserve">Під час виконання практичного завдання до Теми </w:t>
+      </w:r>
+      <w:r>
+        <w:rPr>
+          <w:lang w:val="uk-UA"/>
+        </w:rPr>
+        <w:t>№</w:t>
+      </w:r>
+      <w:r>
+        <w:rPr>
+          <w:lang w:val="uk-UA"/>
+        </w:rPr>
+        <w:t>1 було надано варіанти рішення до наступних задач:</w:t>
+      </w:r>
+    </w:p>
+    <w:p>
+      <w:pPr>
+        <w:rPr>
           <w:b/>
           <w:bCs/>
+          <w:lang w:val="uk-UA"/>
         </w:rPr>
       </w:pPr>
       <w:r>
@@ -17,91 +126,6 @@
           <w:bCs/>
           <w:lang w:val="uk-UA"/>
         </w:rPr>
-        <w:t xml:space="preserve">Звіт про виконання практичних завдань до лекцій з курсу Технології програмування на мові </w:t>
-      </w:r>
-      <w:r>
-        <w:rPr>
-          <w:b/>
-          <w:bCs/>
-        </w:rPr>
-        <w:t>Python</w:t>
-      </w:r>
-    </w:p>
-    <w:p/>
-    <w:p>
-      <w:pPr>
-        <w:rPr>
-          <w:lang w:val="ru-RU"/>
-        </w:rPr>
-      </w:pPr>
-    </w:p>
-    <w:p>
-      <w:pPr>
-        <w:jc w:val="right"/>
-        <w:rPr>
-          <w:lang w:val="uk-UA"/>
-        </w:rPr>
-      </w:pPr>
-      <w:r>
-        <w:rPr>
-          <w:lang w:val="uk-UA"/>
-        </w:rPr>
-        <w:t>Звіт до Теми №1</w:t>
-      </w:r>
-    </w:p>
-    <w:p>
-      <w:pPr>
-        <w:jc w:val="right"/>
-        <w:rPr>
-          <w:lang w:val="uk-UA"/>
-        </w:rPr>
-      </w:pPr>
-      <w:r>
-        <w:rPr>
-          <w:lang w:val="uk-UA"/>
-        </w:rPr>
-        <w:t>Функції та змінні</w:t>
-      </w:r>
-    </w:p>
-    <w:p>
-      <w:pPr>
-        <w:rPr>
-          <w:lang w:val="uk-UA"/>
-        </w:rPr>
-      </w:pPr>
-      <w:r>
-        <w:rPr>
-          <w:lang w:val="uk-UA"/>
-        </w:rPr>
-        <w:t xml:space="preserve">Під час виконання практичного завдання до Теми </w:t>
-      </w:r>
-      <w:r>
-        <w:rPr>
-          <w:lang w:val="uk-UA"/>
-        </w:rPr>
-        <w:t>№</w:t>
-      </w:r>
-      <w:r>
-        <w:rPr>
-          <w:lang w:val="uk-UA"/>
-        </w:rPr>
-        <w:t>1 було надано варіанти рішення до наступних задач:</w:t>
-      </w:r>
-    </w:p>
-    <w:p>
-      <w:pPr>
-        <w:rPr>
-          <w:b/>
-          <w:bCs/>
-          <w:lang w:val="uk-UA"/>
-        </w:rPr>
-      </w:pPr>
-      <w:r>
-        <w:rPr>
-          <w:b/>
-          <w:bCs/>
-          <w:lang w:val="uk-UA"/>
-        </w:rPr>
         <w:t>Перетворення рядка</w:t>
       </w:r>
     </w:p>
@@ -165,13 +189,42 @@
     </w:p>
     <w:p>
       <w:pPr>
-        <w:rPr>
-          <w:lang w:val="uk-UA"/>
-        </w:rPr>
-      </w:pPr>
-    </w:p>
-    <w:p>
-      <w:pPr>
+        <w:pStyle w:val="Normal"/>
+      </w:pPr>
+      <w:r>
+        <w:rPr>
+          <w:rFonts w:ascii="Times New Roman" w:hAnsi="Times New Roman" w:eastAsia="Times New Roman" w:cs="Times New Roman"/>
+          <w:noProof w:val="0"/>
+          <w:sz w:val="28"/>
+          <w:szCs w:val="28"/>
+          <w:lang w:val="uk-UA"/>
+        </w:rPr>
+        <w:t xml:space="preserve">Для перетворення рядка використовується зворотний зріз </w:t>
+      </w:r>
+      <w:r>
+        <w:rPr>
+          <w:rFonts w:ascii="Consolas" w:hAnsi="Consolas" w:eastAsia="Consolas" w:cs="Consolas"/>
+          <w:noProof w:val="0"/>
+          <w:sz w:val="28"/>
+          <w:szCs w:val="28"/>
+          <w:lang w:val="uk-UA"/>
+        </w:rPr>
+        <w:t>[::-1]</w:t>
+      </w:r>
+      <w:r>
+        <w:rPr>
+          <w:rFonts w:ascii="Times New Roman" w:hAnsi="Times New Roman" w:eastAsia="Times New Roman" w:cs="Times New Roman"/>
+          <w:noProof w:val="0"/>
+          <w:sz w:val="28"/>
+          <w:szCs w:val="28"/>
+          <w:lang w:val="uk-UA"/>
+        </w:rPr>
+        <w:t>, який змінює порядок символів рядка на протилежний. Оскільки довжина рядка є фіксованою (10 символів), результат завжди буде мати такий самий розмір.</w:t>
+      </w:r>
+    </w:p>
+    <w:p>
+      <w:pPr>
+        <w:pStyle w:val="Normal"/>
         <w:rPr>
           <w:lang w:val="uk-UA"/>
         </w:rPr>
@@ -197,17 +250,126 @@
         <w:tc>
           <w:tcPr>
             <w:tcW w:w="8545" w:type="dxa"/>
+            <w:tcMar/>
           </w:tcPr>
           <w:p>
             <w:pPr>
               <w:ind w:firstLine="0"/>
+            </w:pPr>
+            <w:r>
               <w:rPr>
                 <w:rFonts w:ascii="Courier New" w:hAnsi="Courier New" w:cs="Courier New"/>
                 <w:sz w:val="20"/>
                 <w:szCs w:val="20"/>
                 <w:lang w:val="uk-UA"/>
               </w:rPr>
+              <w:t>def reverse_string(s):</w:t>
+            </w:r>
+          </w:p>
+          <w:p>
+            <w:pPr>
+              <w:pStyle w:val="Normal"/>
+              <w:ind w:firstLine="0"/>
             </w:pPr>
+            <w:r>
+              <w:rPr>
+                <w:rFonts w:ascii="Courier New" w:hAnsi="Courier New" w:cs="Courier New"/>
+                <w:sz w:val="20"/>
+                <w:szCs w:val="20"/>
+                <w:lang w:val="uk-UA"/>
+              </w:rPr>
+              <w:t xml:space="preserve">    return s[::-1]</w:t>
+            </w:r>
+          </w:p>
+          <w:p>
+            <w:pPr>
+              <w:pStyle w:val="Normal"/>
+              <w:ind w:firstLine="0"/>
+            </w:pPr>
+            <w:r>
+              <w:rPr>
+                <w:rFonts w:ascii="Courier New" w:hAnsi="Courier New" w:cs="Courier New"/>
+                <w:sz w:val="20"/>
+                <w:szCs w:val="20"/>
+                <w:lang w:val="uk-UA"/>
+              </w:rPr>
+              <w:t xml:space="preserve"> </w:t>
+            </w:r>
+          </w:p>
+          <w:p>
+            <w:pPr>
+              <w:pStyle w:val="Normal"/>
+              <w:ind w:firstLine="0"/>
+            </w:pPr>
+            <w:r>
+              <w:rPr>
+                <w:rFonts w:ascii="Courier New" w:hAnsi="Courier New" w:cs="Courier New"/>
+                <w:sz w:val="20"/>
+                <w:szCs w:val="20"/>
+                <w:lang w:val="uk-UA"/>
+              </w:rPr>
+              <w:t>original = "abcdefg123"</w:t>
+            </w:r>
+          </w:p>
+          <w:p>
+            <w:pPr>
+              <w:pStyle w:val="Normal"/>
+              <w:ind w:firstLine="0"/>
+            </w:pPr>
+            <w:r>
+              <w:rPr>
+                <w:rFonts w:ascii="Courier New" w:hAnsi="Courier New" w:cs="Courier New"/>
+                <w:sz w:val="20"/>
+                <w:szCs w:val="20"/>
+                <w:lang w:val="uk-UA"/>
+              </w:rPr>
+              <w:t>result = reverse_string(original)</w:t>
+            </w:r>
+          </w:p>
+          <w:p>
+            <w:pPr>
+              <w:pStyle w:val="Normal"/>
+              <w:ind w:firstLine="0"/>
+            </w:pPr>
+            <w:r>
+              <w:rPr>
+                <w:rFonts w:ascii="Courier New" w:hAnsi="Courier New" w:cs="Courier New"/>
+                <w:sz w:val="20"/>
+                <w:szCs w:val="20"/>
+                <w:lang w:val="uk-UA"/>
+              </w:rPr>
+              <w:t xml:space="preserve"> </w:t>
+            </w:r>
+          </w:p>
+          <w:p>
+            <w:pPr>
+              <w:pStyle w:val="Normal"/>
+              <w:ind w:firstLine="0"/>
+            </w:pPr>
+            <w:r>
+              <w:rPr>
+                <w:rFonts w:ascii="Courier New" w:hAnsi="Courier New" w:cs="Courier New"/>
+                <w:sz w:val="20"/>
+                <w:szCs w:val="20"/>
+                <w:lang w:val="uk-UA"/>
+              </w:rPr>
+              <w:t>print("Оригінал:", original)</w:t>
+            </w:r>
+          </w:p>
+          <w:p>
+            <w:pPr>
+              <w:pStyle w:val="Normal"/>
+              <w:ind w:firstLine="0"/>
+            </w:pPr>
+            <w:r>
+              <w:rPr>
+                <w:rFonts w:ascii="Courier New" w:hAnsi="Courier New" w:cs="Courier New"/>
+                <w:sz w:val="20"/>
+                <w:szCs w:val="20"/>
+                <w:lang w:val="uk-UA"/>
+              </w:rPr>
+              <w:t>print("Результат:", result)</w:t>
+            </w:r>
           </w:p>
         </w:tc>
       </w:tr>
@@ -220,22 +382,55 @@
       </w:pPr>
     </w:p>
     <w:p>
-      <w:pPr>
+      <w:pPr/>
+      <w:r>
+        <w:rPr>
+          <w:lang w:val="uk-UA"/>
+        </w:rPr>
+        <w:t xml:space="preserve">Посилання на </w:t>
+      </w:r>
+      <w:r>
+        <w:rPr/>
+        <w:t>github</w:t>
+      </w:r>
+      <w:r>
         <w:rPr>
           <w:lang w:val="ru-RU"/>
         </w:rPr>
-      </w:pPr>
-      <w:r>
-        <w:rPr>
-          <w:lang w:val="uk-UA"/>
-        </w:rPr>
-        <w:t xml:space="preserve">Посилання на </w:t>
-      </w:r>
-      <w:proofErr w:type="spellStart"/>
-      <w:r>
+        <w:t>:</w:t>
+      </w:r>
+    </w:p>
+    <w:p>
+      <w:pPr/>
+      <w:hyperlink r:id="Rf5d78c993a414c57">
+        <w:r>
+          <w:rPr>
+            <w:rStyle w:val="Hyperlink"/>
+            <w:lang w:val="ru-RU"/>
+          </w:rPr>
+          <w:t>https://github.com/Akimoree</w:t>
+        </w:r>
+        <w:r>
+          <w:rPr>
+            <w:rStyle w:val="Hyperlink"/>
+            <w:lang w:val="ru-RU"/>
+          </w:rPr>
+          <w:t>/TP-KB-251-Illia-Chernonoh</w:t>
+        </w:r>
+      </w:hyperlink>
+    </w:p>
+    <w:p>
+      <w:pPr/>
+      <w:r>
+        <w:rPr>
+          <w:lang w:val="uk-UA"/>
+        </w:rPr>
+        <w:t xml:space="preserve">Знімок екрану з посилання на </w:t>
+      </w:r>
+      <w:r>
+        <w:rPr/>
         <w:t>github</w:t>
       </w:r>
-      <w:proofErr w:type="spellEnd"/>
       <w:r>
         <w:rPr>
           <w:lang w:val="ru-RU"/>
@@ -245,37 +440,69 @@
     </w:p>
     <w:p>
       <w:pPr>
-        <w:rPr>
-          <w:lang w:val="ru-RU"/>
-        </w:rPr>
-      </w:pPr>
-    </w:p>
-    <w:p>
-      <w:pPr>
-        <w:rPr>
-          <w:lang w:val="ru-RU"/>
-        </w:rPr>
-      </w:pPr>
-      <w:r>
-        <w:rPr>
-          <w:lang w:val="uk-UA"/>
-        </w:rPr>
-        <w:t xml:space="preserve">Знімок екрану з посилання на </w:t>
-      </w:r>
-      <w:proofErr w:type="spellStart"/>
-      <w:r>
-        <w:t>github</w:t>
-      </w:r>
-      <w:proofErr w:type="spellEnd"/>
-      <w:r>
-        <w:rPr>
-          <w:lang w:val="ru-RU"/>
-        </w:rPr>
-        <w:t>:</w:t>
+        <w:pStyle w:val="Normal"/>
+        <w:jc w:val="center"/>
+      </w:pPr>
+      <w:r>
+        <w:drawing>
+          <wp:anchor distT="0" distB="0" distL="114300" distR="114300" simplePos="0" relativeHeight="251658240" behindDoc="0" locked="0" layoutInCell="1" allowOverlap="1" wp14:editId="104A9F8F" wp14:anchorId="3F71C718">
+            <wp:simplePos x="0" y="0"/>
+            <wp:positionH relativeFrom="column">
+              <wp:align>right</wp:align>
+            </wp:positionH>
+            <wp:positionV relativeFrom="paragraph">
+              <wp:posOffset>0</wp:posOffset>
+            </wp:positionV>
+            <wp:extent cx="5943600" cy="2933700"/>
+            <wp:effectExtent l="0" t="0" r="0" b="0"/>
+            <wp:wrapSquare wrapText="bothSides"/>
+            <wp:docPr id="1056641689" name="drawing"/>
+            <wp:cNvGraphicFramePr>
+              <a:graphicFrameLocks noChangeAspect="1"/>
+            </wp:cNvGraphicFramePr>
+            <a:graphic>
+              <a:graphicData xmlns:a="http://schemas.openxmlformats.org/drawingml/2006/main" uri="http://schemas.openxmlformats.org/drawingml/2006/picture">
+                <pic:pic xmlns:pic="http://schemas.openxmlformats.org/drawingml/2006/picture">
+                  <pic:nvPicPr>
+                    <pic:cNvPr id="1056641689" name="Picture 1056641689"/>
+                    <pic:cNvPicPr/>
+                  </pic:nvPicPr>
+                  <pic:blipFill>
+                    <a:blip xmlns:r="http://schemas.openxmlformats.org/officeDocument/2006/relationships" r:embed="rId186118514">
+                      <a:extLst>
+                        <a:ext uri="{28A0092B-C50C-407E-A947-70E740481C1C}">
+                          <a14:useLocalDpi xmlns:a14="http://schemas.microsoft.com/office/drawing/2010/main"/>
+                        </a:ext>
+                      </a:extLst>
+                    </a:blip>
+                    <a:stretch>
+                      <a:fillRect/>
+                    </a:stretch>
+                  </pic:blipFill>
+                  <pic:spPr>
+                    <a:xfrm>
+                      <a:off x="0" y="0"/>
+                      <a:ext cx="5943600" cy="2933700"/>
+                    </a:xfrm>
+                    <a:prstGeom prst="rect">
+                      <a:avLst/>
+                    </a:prstGeom>
+                  </pic:spPr>
+                </pic:pic>
+              </a:graphicData>
+            </a:graphic>
+            <wp14:sizeRelH relativeFrom="page">
+              <wp14:pctWidth>0</wp14:pctWidth>
+            </wp14:sizeRelH>
+            <wp14:sizeRelV relativeFrom="page">
+              <wp14:pctHeight>0</wp14:pctHeight>
+            </wp14:sizeRelV>
+          </wp:anchor>
+        </w:drawing>
       </w:r>
     </w:p>
     <w:sectPr>
-      <w:pgSz w:w="12240" w:h="15840"/>
+      <w:pgSz w:w="12240" w:h="15840" w:orient="portrait"/>
       <w:pgMar w:top="1440" w:right="1440" w:bottom="1440" w:left="1440" w:header="720" w:footer="720" w:gutter="0"/>
       <w:cols w:space="720"/>
       <w:docGrid w:linePitch="360"/>
@@ -289,7 +516,7 @@
   <w:docDefaults>
     <w:rPrDefault>
       <w:rPr>
-        <w:rFonts w:asciiTheme="minorHAnsi" w:eastAsiaTheme="minorHAnsi" w:hAnsiTheme="minorHAnsi" w:cstheme="minorBidi"/>
+        <w:rFonts w:asciiTheme="minorHAnsi" w:hAnsiTheme="minorHAnsi" w:eastAsiaTheme="minorHAnsi" w:cstheme="minorBidi"/>
         <w:sz w:val="22"/>
         <w:szCs w:val="22"/>
         <w:lang w:val="en-US" w:eastAsia="en-US" w:bidi="ar-SA"/>
@@ -304,14 +531,14 @@
   <w:latentStyles w:defLockedState="0" w:defUIPriority="99" w:defSemiHidden="0" w:defUnhideWhenUsed="0" w:defQFormat="0" w:count="376">
     <w:lsdException w:name="Normal" w:uiPriority="0" w:qFormat="1"/>
     <w:lsdException w:name="heading 1" w:uiPriority="9" w:qFormat="1"/>
-    <w:lsdException w:name="heading 2" w:semiHidden="1" w:uiPriority="9" w:unhideWhenUsed="1" w:qFormat="1"/>
-    <w:lsdException w:name="heading 3" w:semiHidden="1" w:uiPriority="9" w:unhideWhenUsed="1" w:qFormat="1"/>
-    <w:lsdException w:name="heading 4" w:semiHidden="1" w:uiPriority="9" w:unhideWhenUsed="1" w:qFormat="1"/>
-    <w:lsdException w:name="heading 5" w:semiHidden="1" w:uiPriority="9" w:unhideWhenUsed="1" w:qFormat="1"/>
-    <w:lsdException w:name="heading 6" w:semiHidden="1" w:uiPriority="9" w:unhideWhenUsed="1" w:qFormat="1"/>
-    <w:lsdException w:name="heading 7" w:semiHidden="1" w:uiPriority="9" w:unhideWhenUsed="1" w:qFormat="1"/>
-    <w:lsdException w:name="heading 8" w:semiHidden="1" w:uiPriority="9" w:unhideWhenUsed="1" w:qFormat="1"/>
-    <w:lsdException w:name="heading 9" w:semiHidden="1" w:uiPriority="9" w:unhideWhenUsed="1" w:qFormat="1"/>
+    <w:lsdException w:name="heading 2" w:uiPriority="9" w:semiHidden="1" w:unhideWhenUsed="1" w:qFormat="1"/>
+    <w:lsdException w:name="heading 3" w:uiPriority="9" w:semiHidden="1" w:unhideWhenUsed="1" w:qFormat="1"/>
+    <w:lsdException w:name="heading 4" w:uiPriority="9" w:semiHidden="1" w:unhideWhenUsed="1" w:qFormat="1"/>
+    <w:lsdException w:name="heading 5" w:uiPriority="9" w:semiHidden="1" w:unhideWhenUsed="1" w:qFormat="1"/>
+    <w:lsdException w:name="heading 6" w:uiPriority="9" w:semiHidden="1" w:unhideWhenUsed="1" w:qFormat="1"/>
+    <w:lsdException w:name="heading 7" w:uiPriority="9" w:semiHidden="1" w:unhideWhenUsed="1" w:qFormat="1"/>
+    <w:lsdException w:name="heading 8" w:uiPriority="9" w:semiHidden="1" w:unhideWhenUsed="1" w:qFormat="1"/>
+    <w:lsdException w:name="heading 9" w:uiPriority="9" w:semiHidden="1" w:unhideWhenUsed="1" w:qFormat="1"/>
     <w:lsdException w:name="index 1" w:semiHidden="1" w:unhideWhenUsed="1"/>
     <w:lsdException w:name="index 2" w:semiHidden="1" w:unhideWhenUsed="1"/>
     <w:lsdException w:name="index 3" w:semiHidden="1" w:unhideWhenUsed="1"/>
@@ -321,22 +548,22 @@
     <w:lsdException w:name="index 7" w:semiHidden="1" w:unhideWhenUsed="1"/>
     <w:lsdException w:name="index 8" w:semiHidden="1" w:unhideWhenUsed="1"/>
     <w:lsdException w:name="index 9" w:semiHidden="1" w:unhideWhenUsed="1"/>
-    <w:lsdException w:name="toc 1" w:semiHidden="1" w:uiPriority="39" w:unhideWhenUsed="1"/>
-    <w:lsdException w:name="toc 2" w:semiHidden="1" w:uiPriority="39" w:unhideWhenUsed="1"/>
-    <w:lsdException w:name="toc 3" w:semiHidden="1" w:uiPriority="39" w:unhideWhenUsed="1"/>
-    <w:lsdException w:name="toc 4" w:semiHidden="1" w:uiPriority="39" w:unhideWhenUsed="1"/>
-    <w:lsdException w:name="toc 5" w:semiHidden="1" w:uiPriority="39" w:unhideWhenUsed="1"/>
-    <w:lsdException w:name="toc 6" w:semiHidden="1" w:uiPriority="39" w:unhideWhenUsed="1"/>
-    <w:lsdException w:name="toc 7" w:semiHidden="1" w:uiPriority="39" w:unhideWhenUsed="1"/>
-    <w:lsdException w:name="toc 8" w:semiHidden="1" w:uiPriority="39" w:unhideWhenUsed="1"/>
-    <w:lsdException w:name="toc 9" w:semiHidden="1" w:uiPriority="39" w:unhideWhenUsed="1"/>
+    <w:lsdException w:name="toc 1" w:uiPriority="39" w:semiHidden="1" w:unhideWhenUsed="1"/>
+    <w:lsdException w:name="toc 2" w:uiPriority="39" w:semiHidden="1" w:unhideWhenUsed="1"/>
+    <w:lsdException w:name="toc 3" w:uiPriority="39" w:semiHidden="1" w:unhideWhenUsed="1"/>
+    <w:lsdException w:name="toc 4" w:uiPriority="39" w:semiHidden="1" w:unhideWhenUsed="1"/>
+    <w:lsdException w:name="toc 5" w:uiPriority="39" w:semiHidden="1" w:unhideWhenUsed="1"/>
+    <w:lsdException w:name="toc 6" w:uiPriority="39" w:semiHidden="1" w:unhideWhenUsed="1"/>
+    <w:lsdException w:name="toc 7" w:uiPriority="39" w:semiHidden="1" w:unhideWhenUsed="1"/>
+    <w:lsdException w:name="toc 8" w:uiPriority="39" w:semiHidden="1" w:unhideWhenUsed="1"/>
+    <w:lsdException w:name="toc 9" w:uiPriority="39" w:semiHidden="1" w:unhideWhenUsed="1"/>
     <w:lsdException w:name="Normal Indent" w:semiHidden="1" w:unhideWhenUsed="1"/>
     <w:lsdException w:name="footnote text" w:semiHidden="1" w:unhideWhenUsed="1"/>
     <w:lsdException w:name="annotation text" w:semiHidden="1" w:unhideWhenUsed="1"/>
     <w:lsdException w:name="header" w:semiHidden="1" w:unhideWhenUsed="1"/>
     <w:lsdException w:name="footer" w:semiHidden="1" w:unhideWhenUsed="1"/>
     <w:lsdException w:name="index heading" w:semiHidden="1" w:unhideWhenUsed="1"/>
-    <w:lsdException w:name="caption" w:semiHidden="1" w:uiPriority="35" w:unhideWhenUsed="1" w:qFormat="1"/>
+    <w:lsdException w:name="caption" w:uiPriority="35" w:semiHidden="1" w:unhideWhenUsed="1" w:qFormat="1"/>
     <w:lsdException w:name="table of figures" w:semiHidden="1" w:unhideWhenUsed="1"/>
     <w:lsdException w:name="envelope address" w:semiHidden="1" w:unhideWhenUsed="1"/>
     <w:lsdException w:name="envelope return" w:semiHidden="1" w:unhideWhenUsed="1"/>
@@ -367,7 +594,7 @@
     <w:lsdException w:name="Title" w:uiPriority="10" w:qFormat="1"/>
     <w:lsdException w:name="Closing" w:semiHidden="1" w:unhideWhenUsed="1"/>
     <w:lsdException w:name="Signature" w:semiHidden="1" w:unhideWhenUsed="1"/>
-    <w:lsdException w:name="Default Paragraph Font" w:semiHidden="1" w:uiPriority="1" w:unhideWhenUsed="1"/>
+    <w:lsdException w:name="Default Paragraph Font" w:uiPriority="1" w:semiHidden="1" w:unhideWhenUsed="1"/>
     <w:lsdException w:name="Body Text" w:semiHidden="1" w:unhideWhenUsed="1"/>
     <w:lsdException w:name="Body Text Indent" w:semiHidden="1" w:unhideWhenUsed="1"/>
     <w:lsdException w:name="List Continue" w:semiHidden="1" w:unhideWhenUsed="1"/>
@@ -567,8 +794,8 @@
     <w:lsdException w:name="Subtle Reference" w:uiPriority="31" w:qFormat="1"/>
     <w:lsdException w:name="Intense Reference" w:uiPriority="32" w:qFormat="1"/>
     <w:lsdException w:name="Book Title" w:uiPriority="33" w:qFormat="1"/>
-    <w:lsdException w:name="Bibliography" w:semiHidden="1" w:uiPriority="37" w:unhideWhenUsed="1"/>
-    <w:lsdException w:name="TOC Heading" w:semiHidden="1" w:uiPriority="39" w:unhideWhenUsed="1" w:qFormat="1"/>
+    <w:lsdException w:name="Bibliography" w:uiPriority="37" w:semiHidden="1" w:unhideWhenUsed="1"/>
+    <w:lsdException w:name="TOC Heading" w:uiPriority="39" w:semiHidden="1" w:unhideWhenUsed="1" w:qFormat="1"/>
     <w:lsdException w:name="Plain Table 1" w:uiPriority="41"/>
     <w:lsdException w:name="Plain Table 2" w:uiPriority="42"/>
     <w:lsdException w:name="Plain Table 3" w:uiPriority="43"/>
@@ -679,7 +906,7 @@
     <w:lsdException w:name="Unresolved Mention" w:semiHidden="1" w:unhideWhenUsed="1"/>
     <w:lsdException w:name="Smart Link" w:semiHidden="1" w:unhideWhenUsed="1"/>
   </w:latentStyles>
-  <w:style w:type="paragraph" w:default="1" w:styleId="Normal">
+  <w:style w:type="paragraph" w:styleId="Normal" w:default="1">
     <w:name w:val="Normal"/>
     <w:qFormat/>
     <w:rsid w:val="0046193E"/>
@@ -693,13 +920,13 @@
       <w:sz w:val="28"/>
     </w:rPr>
   </w:style>
-  <w:style w:type="character" w:default="1" w:styleId="DefaultParagraphFont">
+  <w:style w:type="character" w:styleId="DefaultParagraphFont" w:default="1">
     <w:name w:val="Default Paragraph Font"/>
     <w:uiPriority w:val="1"/>
     <w:semiHidden/>
     <w:unhideWhenUsed/>
   </w:style>
-  <w:style w:type="table" w:default="1" w:styleId="TableNormal">
+  <w:style w:type="table" w:styleId="TableNormal" w:default="1">
     <w:name w:val="Normal Table"/>
     <w:uiPriority w:val="99"/>
     <w:semiHidden/>
@@ -714,7 +941,7 @@
       </w:tblCellMar>
     </w:tblPr>
   </w:style>
-  <w:style w:type="numbering" w:default="1" w:styleId="NoList">
+  <w:style w:type="numbering" w:styleId="NoList" w:default="1">
     <w:name w:val="No List"/>
     <w:uiPriority w:val="99"/>
     <w:semiHidden/>
@@ -730,20 +957,31 @@
     </w:pPr>
     <w:tblPr>
       <w:tblBorders>
-        <w:top w:val="single" w:sz="4" w:space="0" w:color="auto"/>
-        <w:left w:val="single" w:sz="4" w:space="0" w:color="auto"/>
-        <w:bottom w:val="single" w:sz="4" w:space="0" w:color="auto"/>
-        <w:right w:val="single" w:sz="4" w:space="0" w:color="auto"/>
-        <w:insideH w:val="single" w:sz="4" w:space="0" w:color="auto"/>
-        <w:insideV w:val="single" w:sz="4" w:space="0" w:color="auto"/>
+        <w:top w:val="single" w:color="auto" w:sz="4" w:space="0"/>
+        <w:left w:val="single" w:color="auto" w:sz="4" w:space="0"/>
+        <w:bottom w:val="single" w:color="auto" w:sz="4" w:space="0"/>
+        <w:right w:val="single" w:color="auto" w:sz="4" w:space="0"/>
+        <w:insideH w:val="single" w:color="auto" w:sz="4" w:space="0"/>
+        <w:insideV w:val="single" w:color="auto" w:sz="4" w:space="0"/>
       </w:tblBorders>
     </w:tblPr>
+  </w:style>
+  <w:style w:type="character" w:styleId="Hyperlink">
+    <w:uiPriority w:val="99"/>
+    <w:name w:val="Hyperlink"/>
+    <w:basedOn w:val="DefaultParagraphFont"/>
+    <w:unhideWhenUsed/>
+    <w:rsid w:val="6F787EEB"/>
+    <w:rPr>
+      <w:color w:val="0563C1"/>
+      <w:u w:val="single"/>
+    </w:rPr>
   </w:style>
 </w:styles>
 </file>
 
 <file path=word/theme/theme1.xml><?xml version="1.0" encoding="utf-8"?>
-<a:theme xmlns:a="http://schemas.openxmlformats.org/drawingml/2006/main" name="Office Theme">
+<a:theme xmlns:a="http://schemas.openxmlformats.org/drawingml/2006/main" xmlns:thm15="http://schemas.microsoft.com/office/thememl/2012/main" name="Office Theme">
   <a:themeElements>
     <a:clrScheme name="Office">
       <a:dk1>

</xml_diff>

<commit_message>
add report for topic 02
</commit_message>
<xml_diff>
--- a/TP-KB-251-Illia-Chernonoh-lpr.docx
+++ b/TP-KB-251-Illia-Chernonoh-lpr.docx
@@ -3713,6 +3713,7 @@
           <w:numId w:val="4"/>
         </w:numPr>
         <w:spacing w:before="0" w:beforeAutospacing="off" w:after="0" w:afterAutospacing="off"/>
+        <w:ind/>
         <w:rPr>
           <w:rFonts w:ascii="Times New Roman" w:hAnsi="Times New Roman" w:eastAsia="Times New Roman" w:cs="Times New Roman"/>
           <w:noProof w:val="0"/>
@@ -3755,16 +3756,24 @@
     <w:p>
       <w:pPr>
         <w:pStyle w:val="Normal"/>
-        <w:ind w:firstLine="0"/>
-        <w:rPr>
-          <w:lang w:val="uk-UA"/>
-        </w:rPr>
-      </w:pPr>
+        <w:ind/>
+        <w:rPr>
+          <w:lang w:val="uk-UA"/>
+        </w:rPr>
+      </w:pPr>
+    </w:p>
+    <w:p>
+      <w:pPr>
+        <w:ind/>
+      </w:pPr>
+      <w:r>
+        <w:br w:type="page"/>
+      </w:r>
     </w:p>
     <w:p>
       <w:pPr>
         <w:pStyle w:val="Normal"/>
-        <w:ind w:firstLine="0"/>
+        <w:ind/>
         <w:rPr>
           <w:lang w:val="uk-UA"/>
         </w:rPr>
@@ -3783,10 +3792,10 @@
       </w:pPr>
       <w:r>
         <w:drawing>
-          <wp:inline wp14:editId="717C8EE4" wp14:anchorId="78E765F9">
-            <wp:extent cx="3391373" cy="3562847"/>
+          <wp:inline wp14:editId="6ED9BEAD" wp14:anchorId="1DF4862B">
+            <wp:extent cx="3425382" cy="5438775"/>
             <wp:effectExtent l="0" t="0" r="0" b="0"/>
-            <wp:docPr id="288402910" name="drawing"/>
+            <wp:docPr id="2003525438" name="drawing"/>
             <wp:cNvGraphicFramePr>
               <a:graphicFrameLocks noChangeAspect="1"/>
             </wp:cNvGraphicFramePr>
@@ -3794,11 +3803,11 @@
               <a:graphicData xmlns:a="http://schemas.openxmlformats.org/drawingml/2006/main" uri="http://schemas.openxmlformats.org/drawingml/2006/picture">
                 <pic:pic xmlns:pic="http://schemas.openxmlformats.org/drawingml/2006/picture">
                   <pic:nvPicPr>
-                    <pic:cNvPr id="288402910" name="Picture 288402910"/>
+                    <pic:cNvPr id="2003525438" name="Picture 2003525438"/>
                     <pic:cNvPicPr/>
                   </pic:nvPicPr>
                   <pic:blipFill>
-                    <a:blip xmlns:r="http://schemas.openxmlformats.org/officeDocument/2006/relationships" r:embed="rId1917556107">
+                    <a:blip xmlns:r="http://schemas.openxmlformats.org/officeDocument/2006/relationships" r:embed="rId796812486">
                       <a:extLst>
                         <a:ext uri="{28A0092B-C50C-407E-A947-70E740481C1C}">
                           <a14:useLocalDpi xmlns:a14="http://schemas.microsoft.com/office/drawing/2010/main"/>
@@ -3810,9 +3819,9 @@
                     </a:stretch>
                   </pic:blipFill>
                   <pic:spPr>
-                    <a:xfrm>
+                    <a:xfrm rot="0">
                       <a:off x="0" y="0"/>
-                      <a:ext cx="3391373" cy="3562847"/>
+                      <a:ext cx="3425382" cy="5438775"/>
                     </a:xfrm>
                     <a:prstGeom prst="rect">
                       <a:avLst/>
@@ -4115,10 +4124,10 @@
       </w:pPr>
       <w:r>
         <w:drawing>
-          <wp:inline wp14:editId="60F7E745" wp14:anchorId="07CFFC00">
-            <wp:extent cx="3164205" cy="3943901"/>
+          <wp:inline wp14:editId="1B44849B" wp14:anchorId="260854CF">
+            <wp:extent cx="4315427" cy="5525271"/>
             <wp:effectExtent l="0" t="0" r="0" b="0"/>
-            <wp:docPr id="1415739441" name="drawing"/>
+            <wp:docPr id="482060563" name="drawing"/>
             <wp:cNvGraphicFramePr>
               <a:graphicFrameLocks noChangeAspect="1"/>
             </wp:cNvGraphicFramePr>
@@ -4126,11 +4135,11 @@
               <a:graphicData xmlns:a="http://schemas.openxmlformats.org/drawingml/2006/main" uri="http://schemas.openxmlformats.org/drawingml/2006/picture">
                 <pic:pic xmlns:pic="http://schemas.openxmlformats.org/drawingml/2006/picture">
                   <pic:nvPicPr>
-                    <pic:cNvPr id="1415739441" name="Picture 1415739441"/>
+                    <pic:cNvPr id="482060563" name="Picture 482060563"/>
                     <pic:cNvPicPr/>
                   </pic:nvPicPr>
                   <pic:blipFill>
-                    <a:blip xmlns:r="http://schemas.openxmlformats.org/officeDocument/2006/relationships" r:embed="rId1164618241">
+                    <a:blip xmlns:r="http://schemas.openxmlformats.org/officeDocument/2006/relationships" r:embed="rId1968467942">
                       <a:extLst>
                         <a:ext uri="{28A0092B-C50C-407E-A947-70E740481C1C}">
                           <a14:useLocalDpi xmlns:a14="http://schemas.microsoft.com/office/drawing/2010/main"/>
@@ -4142,9 +4151,9 @@
                     </a:stretch>
                   </pic:blipFill>
                   <pic:spPr>
-                    <a:xfrm rot="0">
+                    <a:xfrm>
                       <a:off x="0" y="0"/>
-                      <a:ext cx="3164205" cy="3943901"/>
+                      <a:ext cx="4315427" cy="5525271"/>
                     </a:xfrm>
                     <a:prstGeom prst="rect">
                       <a:avLst/>
@@ -4349,7 +4358,7 @@
         <w:t>3) Калькулятор з використанням match</w:t>
       </w:r>
     </w:p>
-    <w:p>
+    <w:p w14:noSpellErr="1">
       <w:pPr>
         <w:spacing w:before="240" w:beforeAutospacing="off" w:after="240" w:afterAutospacing="off"/>
         <w:jc w:val="both"/>
@@ -4559,10 +4568,10 @@
       </w:pPr>
       <w:r>
         <w:drawing>
-          <wp:inline wp14:editId="31BA1F4D" wp14:anchorId="6942B4C7">
-            <wp:extent cx="3199368" cy="4201112"/>
+          <wp:inline wp14:editId="4A595E44" wp14:anchorId="29E30D97">
+            <wp:extent cx="3461232" cy="4481060"/>
             <wp:effectExtent l="0" t="0" r="0" b="0"/>
-            <wp:docPr id="1262626686" name="drawing"/>
+            <wp:docPr id="1930264295" name="drawing"/>
             <wp:cNvGraphicFramePr>
               <a:graphicFrameLocks noChangeAspect="1"/>
             </wp:cNvGraphicFramePr>
@@ -4570,11 +4579,11 @@
               <a:graphicData xmlns:a="http://schemas.openxmlformats.org/drawingml/2006/main" uri="http://schemas.openxmlformats.org/drawingml/2006/picture">
                 <pic:pic xmlns:pic="http://schemas.openxmlformats.org/drawingml/2006/picture">
                   <pic:nvPicPr>
-                    <pic:cNvPr id="1262626686" name="Picture 1262626686"/>
+                    <pic:cNvPr id="1930264295" name="Picture 1930264295"/>
                     <pic:cNvPicPr/>
                   </pic:nvPicPr>
                   <pic:blipFill>
-                    <a:blip xmlns:r="http://schemas.openxmlformats.org/officeDocument/2006/relationships" r:embed="rId28540363">
+                    <a:blip xmlns:r="http://schemas.openxmlformats.org/officeDocument/2006/relationships" r:embed="rId2067542321">
                       <a:extLst>
                         <a:ext uri="{28A0092B-C50C-407E-A947-70E740481C1C}">
                           <a14:useLocalDpi xmlns:a14="http://schemas.microsoft.com/office/drawing/2010/main"/>
@@ -4588,7 +4597,7 @@
                   <pic:spPr>
                     <a:xfrm rot="0">
                       <a:off x="0" y="0"/>
-                      <a:ext cx="3199368" cy="4201112"/>
+                      <a:ext cx="3461232" cy="4481060"/>
                     </a:xfrm>
                     <a:prstGeom prst="rect">
                       <a:avLst/>

</xml_diff>